<commit_message>
update: minh chung va BT phan2
</commit_message>
<xml_diff>
--- a/minhchung.docx
+++ b/minhchung.docx
@@ -46,6 +46,9 @@
         <w:ind w:left="360"/>
       </w:pPr>
       <w:r>
+        <w:rPr>
+          <w:noProof/>
+        </w:rPr>
         <w:drawing>
           <wp:inline distT="0" distB="0" distL="0" distR="0" wp14:anchorId="41EBC3A7" wp14:editId="6CE0BE99">
             <wp:extent cx="5943600" cy="454660"/>
@@ -103,6 +106,9 @@
         <w:ind w:left="360"/>
       </w:pPr>
       <w:r>
+        <w:rPr>
+          <w:noProof/>
+        </w:rPr>
         <w:drawing>
           <wp:inline distT="0" distB="0" distL="0" distR="0" wp14:anchorId="332335BD" wp14:editId="2ED5A9DB">
             <wp:extent cx="5943600" cy="3343275"/>
@@ -226,6 +232,9 @@
         <w:ind w:left="360"/>
       </w:pPr>
       <w:r>
+        <w:rPr>
+          <w:noProof/>
+        </w:rPr>
         <w:lastRenderedPageBreak/>
         <w:drawing>
           <wp:inline distT="0" distB="0" distL="0" distR="0" wp14:anchorId="2347BF4D" wp14:editId="4AE771AC">
@@ -289,6 +298,9 @@
         <w:ind w:left="360"/>
       </w:pPr>
       <w:r>
+        <w:rPr>
+          <w:noProof/>
+        </w:rPr>
         <w:drawing>
           <wp:inline distT="0" distB="0" distL="0" distR="0" wp14:anchorId="3096B34D" wp14:editId="4D8FDD42">
             <wp:extent cx="5943600" cy="425450"/>
@@ -346,6 +358,9 @@
         <w:ind w:left="360"/>
       </w:pPr>
       <w:r>
+        <w:rPr>
+          <w:noProof/>
+        </w:rPr>
         <w:drawing>
           <wp:inline distT="0" distB="0" distL="0" distR="0" wp14:anchorId="66DCFA46" wp14:editId="66DB36AB">
             <wp:extent cx="5943600" cy="628015"/>
@@ -403,6 +418,9 @@
         <w:ind w:left="360"/>
       </w:pPr>
       <w:r>
+        <w:rPr>
+          <w:noProof/>
+        </w:rPr>
         <w:drawing>
           <wp:inline distT="0" distB="0" distL="0" distR="0" wp14:anchorId="4E7F938C" wp14:editId="75CF2228">
             <wp:extent cx="5943600" cy="3429635"/>
@@ -460,6 +478,9 @@
         <w:ind w:left="360"/>
       </w:pPr>
       <w:r>
+        <w:rPr>
+          <w:noProof/>
+        </w:rPr>
         <w:drawing>
           <wp:inline distT="0" distB="0" distL="0" distR="0" wp14:anchorId="44B5A18D" wp14:editId="604BE4A9">
             <wp:extent cx="5943600" cy="266700"/>
@@ -517,6 +538,9 @@
         <w:ind w:left="360"/>
       </w:pPr>
       <w:r>
+        <w:rPr>
+          <w:noProof/>
+        </w:rPr>
         <w:drawing>
           <wp:inline distT="0" distB="0" distL="0" distR="0" wp14:anchorId="49B4C9D2" wp14:editId="0BF47ECF">
             <wp:extent cx="5943600" cy="233045"/>
@@ -574,6 +598,9 @@
         <w:ind w:left="360"/>
       </w:pPr>
       <w:r>
+        <w:rPr>
+          <w:noProof/>
+        </w:rPr>
         <w:lastRenderedPageBreak/>
         <w:drawing>
           <wp:inline distT="0" distB="0" distL="0" distR="0" wp14:anchorId="6FF04656" wp14:editId="27424F31">
@@ -632,6 +659,9 @@
         <w:ind w:left="360"/>
       </w:pPr>
       <w:r>
+        <w:rPr>
+          <w:noProof/>
+        </w:rPr>
         <w:drawing>
           <wp:inline distT="0" distB="0" distL="0" distR="0" wp14:anchorId="6306BDFE" wp14:editId="1D95F3F8">
             <wp:extent cx="5943600" cy="1251585"/>
@@ -689,6 +719,9 @@
         <w:ind w:left="360"/>
       </w:pPr>
       <w:r>
+        <w:rPr>
+          <w:noProof/>
+        </w:rPr>
         <w:drawing>
           <wp:inline distT="0" distB="0" distL="0" distR="0" wp14:anchorId="6F755A76" wp14:editId="002CEE80">
             <wp:extent cx="5943600" cy="518795"/>
@@ -746,6 +779,9 @@
         <w:ind w:left="360"/>
       </w:pPr>
       <w:r>
+        <w:rPr>
+          <w:noProof/>
+        </w:rPr>
         <w:drawing>
           <wp:inline distT="0" distB="0" distL="0" distR="0" wp14:anchorId="21567766" wp14:editId="70ABB637">
             <wp:extent cx="5943600" cy="454025"/>
@@ -803,6 +839,9 @@
         <w:ind w:left="360"/>
       </w:pPr>
       <w:r>
+        <w:rPr>
+          <w:noProof/>
+        </w:rPr>
         <w:drawing>
           <wp:inline distT="0" distB="0" distL="0" distR="0" wp14:anchorId="485D260A" wp14:editId="201382AD">
             <wp:extent cx="5943600" cy="2948940"/>
@@ -860,6 +899,9 @@
         <w:ind w:left="360"/>
       </w:pPr>
       <w:r>
+        <w:rPr>
+          <w:noProof/>
+        </w:rPr>
         <w:lastRenderedPageBreak/>
         <w:drawing>
           <wp:inline distT="0" distB="0" distL="0" distR="0" wp14:anchorId="42F02AA0" wp14:editId="6CD51BFC">
@@ -896,6 +938,1892 @@
             </a:graphic>
           </wp:inline>
         </w:drawing>
+      </w:r>
+    </w:p>
+    <w:p>
+      <w:pPr>
+        <w:ind w:left="360"/>
+      </w:pPr>
+    </w:p>
+    <w:p>
+      <w:pPr>
+        <w:ind w:left="360"/>
+      </w:pPr>
+      <w:r>
+        <w:t>Phần 2:</w:t>
+      </w:r>
+      <w:r>
+        <w:tab/>
+        <w:t>Docker Compose file</w:t>
+      </w:r>
+      <w:r>
+        <w:tab/>
+      </w:r>
+      <w:r>
+        <w:tab/>
+      </w:r>
+      <w:r>
+        <w:tab/>
+      </w:r>
+      <w:r>
+        <w:tab/>
+      </w:r>
+    </w:p>
+    <w:p>
+      <w:pPr>
+        <w:ind w:left="360"/>
+      </w:pPr>
+      <w:r>
+        <w:tab/>
+        <w:t>Bài 1: Chạy một container đơn giản với Docker Compose</w:t>
+      </w:r>
+      <w:r>
+        <w:tab/>
+      </w:r>
+      <w:r>
+        <w:tab/>
+      </w:r>
+      <w:r>
+        <w:tab/>
+      </w:r>
+      <w:r>
+        <w:tab/>
+      </w:r>
+    </w:p>
+    <w:p>
+      <w:pPr>
+        <w:ind w:left="360"/>
+      </w:pPr>
+      <w:r>
+        <w:tab/>
+      </w:r>
+      <w:r>
+        <w:tab/>
+        <w:t>Yêu cầu:</w:t>
+      </w:r>
+      <w:r>
+        <w:tab/>
+      </w:r>
+      <w:r>
+        <w:tab/>
+      </w:r>
+      <w:r>
+        <w:tab/>
+      </w:r>
+    </w:p>
+    <w:p>
+      <w:pPr>
+        <w:ind w:left="360"/>
+      </w:pPr>
+      <w:r>
+        <w:tab/>
+      </w:r>
+      <w:r>
+        <w:tab/>
+        <w:t>Tạo một container chạy Nginx bằng Docker Compose.</w:t>
+      </w:r>
+      <w:r>
+        <w:tab/>
+      </w:r>
+      <w:r>
+        <w:tab/>
+      </w:r>
+      <w:r>
+        <w:tab/>
+      </w:r>
+    </w:p>
+    <w:p>
+      <w:pPr>
+        <w:ind w:left="360"/>
+      </w:pPr>
+      <w:r>
+        <w:tab/>
+      </w:r>
+      <w:r>
+        <w:tab/>
+        <w:t>Map cổng 8080 của máy host với cổng 80 của container.</w:t>
+      </w:r>
+      <w:r>
+        <w:tab/>
+      </w:r>
+      <w:r>
+        <w:tab/>
+      </w:r>
+      <w:r>
+        <w:tab/>
+      </w:r>
+    </w:p>
+    <w:p>
+      <w:pPr>
+        <w:ind w:left="360"/>
+      </w:pPr>
+      <w:r>
+        <w:tab/>
+      </w:r>
+      <w:r>
+        <w:tab/>
+      </w:r>
+      <w:r>
+        <w:drawing>
+          <wp:inline distT="0" distB="0" distL="0" distR="0" wp14:anchorId="37495B41" wp14:editId="21BEA6B8">
+            <wp:extent cx="5943600" cy="3343275"/>
+            <wp:effectExtent l="0" t="0" r="0" b="9525"/>
+            <wp:docPr id="1755070941" name="Picture 1"/>
+            <wp:cNvGraphicFramePr>
+              <a:graphicFrameLocks xmlns:a="http://schemas.openxmlformats.org/drawingml/2006/main" noChangeAspect="1"/>
+            </wp:cNvGraphicFramePr>
+            <a:graphic xmlns:a="http://schemas.openxmlformats.org/drawingml/2006/main">
+              <a:graphicData uri="http://schemas.openxmlformats.org/drawingml/2006/picture">
+                <pic:pic xmlns:pic="http://schemas.openxmlformats.org/drawingml/2006/picture">
+                  <pic:nvPicPr>
+                    <pic:cNvPr id="1755070941" name=""/>
+                    <pic:cNvPicPr/>
+                  </pic:nvPicPr>
+                  <pic:blipFill>
+                    <a:blip r:embed="rId20"/>
+                    <a:stretch>
+                      <a:fillRect/>
+                    </a:stretch>
+                  </pic:blipFill>
+                  <pic:spPr>
+                    <a:xfrm>
+                      <a:off x="0" y="0"/>
+                      <a:ext cx="5943600" cy="3343275"/>
+                    </a:xfrm>
+                    <a:prstGeom prst="rect">
+                      <a:avLst/>
+                    </a:prstGeom>
+                  </pic:spPr>
+                </pic:pic>
+              </a:graphicData>
+            </a:graphic>
+          </wp:inline>
+        </w:drawing>
+      </w:r>
+    </w:p>
+    <w:p>
+      <w:pPr>
+        <w:ind w:left="360"/>
+      </w:pPr>
+      <w:r>
+        <w:lastRenderedPageBreak/>
+        <w:drawing>
+          <wp:inline distT="0" distB="0" distL="0" distR="0" wp14:anchorId="02FBFFF7" wp14:editId="12DE5F9B">
+            <wp:extent cx="5943600" cy="3343275"/>
+            <wp:effectExtent l="0" t="0" r="0" b="9525"/>
+            <wp:docPr id="1127759966" name="Picture 1"/>
+            <wp:cNvGraphicFramePr>
+              <a:graphicFrameLocks xmlns:a="http://schemas.openxmlformats.org/drawingml/2006/main" noChangeAspect="1"/>
+            </wp:cNvGraphicFramePr>
+            <a:graphic xmlns:a="http://schemas.openxmlformats.org/drawingml/2006/main">
+              <a:graphicData uri="http://schemas.openxmlformats.org/drawingml/2006/picture">
+                <pic:pic xmlns:pic="http://schemas.openxmlformats.org/drawingml/2006/picture">
+                  <pic:nvPicPr>
+                    <pic:cNvPr id="1127759966" name=""/>
+                    <pic:cNvPicPr/>
+                  </pic:nvPicPr>
+                  <pic:blipFill>
+                    <a:blip r:embed="rId21"/>
+                    <a:stretch>
+                      <a:fillRect/>
+                    </a:stretch>
+                  </pic:blipFill>
+                  <pic:spPr>
+                    <a:xfrm>
+                      <a:off x="0" y="0"/>
+                      <a:ext cx="5943600" cy="3343275"/>
+                    </a:xfrm>
+                    <a:prstGeom prst="rect">
+                      <a:avLst/>
+                    </a:prstGeom>
+                  </pic:spPr>
+                </pic:pic>
+              </a:graphicData>
+            </a:graphic>
+          </wp:inline>
+        </w:drawing>
+      </w:r>
+      <w:r>
+        <w:tab/>
+      </w:r>
+      <w:r>
+        <w:tab/>
+      </w:r>
+      <w:r>
+        <w:tab/>
+      </w:r>
+    </w:p>
+    <w:p>
+      <w:pPr>
+        <w:ind w:left="360"/>
+      </w:pPr>
+      <w:r>
+        <w:tab/>
+        <w:t>Bài 2: Chạy MySQL với Docker Compose</w:t>
+      </w:r>
+      <w:r>
+        <w:tab/>
+      </w:r>
+      <w:r>
+        <w:tab/>
+      </w:r>
+      <w:r>
+        <w:tab/>
+      </w:r>
+      <w:r>
+        <w:tab/>
+      </w:r>
+    </w:p>
+    <w:p>
+      <w:pPr>
+        <w:ind w:left="360"/>
+      </w:pPr>
+      <w:r>
+        <w:tab/>
+      </w:r>
+      <w:r>
+        <w:tab/>
+        <w:t>Yêu cầu:</w:t>
+      </w:r>
+      <w:r>
+        <w:tab/>
+      </w:r>
+      <w:r>
+        <w:tab/>
+      </w:r>
+      <w:r>
+        <w:tab/>
+      </w:r>
+    </w:p>
+    <w:p>
+      <w:pPr>
+        <w:ind w:left="360"/>
+      </w:pPr>
+      <w:r>
+        <w:tab/>
+      </w:r>
+      <w:r>
+        <w:tab/>
+        <w:t>Tạo một container chạy MySQL phiên bản 8.0.</w:t>
+      </w:r>
+      <w:r>
+        <w:tab/>
+      </w:r>
+      <w:r>
+        <w:tab/>
+      </w:r>
+      <w:r>
+        <w:tab/>
+      </w:r>
+    </w:p>
+    <w:p>
+      <w:pPr>
+        <w:ind w:left="360"/>
+      </w:pPr>
+      <w:r>
+        <w:tab/>
+      </w:r>
+      <w:r>
+        <w:tab/>
+        <w:t>Đặt username là user, password là password và database là mydb</w:t>
+      </w:r>
+      <w:r>
+        <w:tab/>
+      </w:r>
+      <w:r>
+        <w:tab/>
+      </w:r>
+      <w:r>
+        <w:tab/>
+      </w:r>
+    </w:p>
+    <w:p>
+      <w:pPr>
+        <w:ind w:left="360"/>
+      </w:pPr>
+      <w:r>
+        <w:lastRenderedPageBreak/>
+        <w:tab/>
+      </w:r>
+      <w:r>
+        <w:drawing>
+          <wp:inline distT="0" distB="0" distL="0" distR="0" wp14:anchorId="57D4578D" wp14:editId="0EF9F0FF">
+            <wp:extent cx="5943600" cy="3343275"/>
+            <wp:effectExtent l="0" t="0" r="0" b="9525"/>
+            <wp:docPr id="1609336816" name="Picture 1"/>
+            <wp:cNvGraphicFramePr>
+              <a:graphicFrameLocks xmlns:a="http://schemas.openxmlformats.org/drawingml/2006/main" noChangeAspect="1"/>
+            </wp:cNvGraphicFramePr>
+            <a:graphic xmlns:a="http://schemas.openxmlformats.org/drawingml/2006/main">
+              <a:graphicData uri="http://schemas.openxmlformats.org/drawingml/2006/picture">
+                <pic:pic xmlns:pic="http://schemas.openxmlformats.org/drawingml/2006/picture">
+                  <pic:nvPicPr>
+                    <pic:cNvPr id="1609336816" name=""/>
+                    <pic:cNvPicPr/>
+                  </pic:nvPicPr>
+                  <pic:blipFill>
+                    <a:blip r:embed="rId22"/>
+                    <a:stretch>
+                      <a:fillRect/>
+                    </a:stretch>
+                  </pic:blipFill>
+                  <pic:spPr>
+                    <a:xfrm>
+                      <a:off x="0" y="0"/>
+                      <a:ext cx="5943600" cy="3343275"/>
+                    </a:xfrm>
+                    <a:prstGeom prst="rect">
+                      <a:avLst/>
+                    </a:prstGeom>
+                  </pic:spPr>
+                </pic:pic>
+              </a:graphicData>
+            </a:graphic>
+          </wp:inline>
+        </w:drawing>
+      </w:r>
+      <w:r>
+        <w:tab/>
+      </w:r>
+      <w:r>
+        <w:tab/>
+      </w:r>
+      <w:r>
+        <w:tab/>
+      </w:r>
+      <w:r>
+        <w:tab/>
+      </w:r>
+    </w:p>
+    <w:p>
+      <w:pPr>
+        <w:ind w:left="360"/>
+      </w:pPr>
+      <w:r>
+        <w:tab/>
+        <w:t>Bài 3: Kết nối MySQL với PHPMyAdmin</w:t>
+      </w:r>
+      <w:r>
+        <w:tab/>
+      </w:r>
+      <w:r>
+        <w:tab/>
+      </w:r>
+      <w:r>
+        <w:tab/>
+      </w:r>
+      <w:r>
+        <w:tab/>
+      </w:r>
+    </w:p>
+    <w:p>
+      <w:pPr>
+        <w:ind w:left="360"/>
+      </w:pPr>
+      <w:r>
+        <w:tab/>
+      </w:r>
+      <w:r>
+        <w:tab/>
+        <w:t>Yêu cầu:</w:t>
+      </w:r>
+      <w:r>
+        <w:tab/>
+      </w:r>
+      <w:r>
+        <w:tab/>
+      </w:r>
+      <w:r>
+        <w:tab/>
+      </w:r>
+    </w:p>
+    <w:p>
+      <w:pPr>
+        <w:ind w:left="360"/>
+      </w:pPr>
+      <w:r>
+        <w:tab/>
+      </w:r>
+      <w:r>
+        <w:tab/>
+        <w:t>Chạy MySQL và PHPMyAdmin với Docker Compose.</w:t>
+      </w:r>
+      <w:r>
+        <w:tab/>
+      </w:r>
+      <w:r>
+        <w:tab/>
+      </w:r>
+      <w:r>
+        <w:tab/>
+      </w:r>
+    </w:p>
+    <w:p>
+      <w:pPr>
+        <w:ind w:left="360"/>
+      </w:pPr>
+      <w:r>
+        <w:tab/>
+      </w:r>
+      <w:r>
+        <w:tab/>
+        <w:t>PHPMyAdmin chạy trên cổng 8081.</w:t>
+      </w:r>
+      <w:r>
+        <w:tab/>
+      </w:r>
+      <w:r>
+        <w:tab/>
+      </w:r>
+      <w:r>
+        <w:tab/>
+      </w:r>
+    </w:p>
+    <w:p>
+      <w:pPr>
+        <w:ind w:left="360"/>
+      </w:pPr>
+      <w:r>
+        <w:lastRenderedPageBreak/>
+        <w:tab/>
+      </w:r>
+      <w:r>
+        <w:drawing>
+          <wp:inline distT="0" distB="0" distL="0" distR="0" wp14:anchorId="48B44AF2" wp14:editId="37C6A25A">
+            <wp:extent cx="5943600" cy="3343275"/>
+            <wp:effectExtent l="0" t="0" r="0" b="9525"/>
+            <wp:docPr id="1068331820" name="Picture 1"/>
+            <wp:cNvGraphicFramePr>
+              <a:graphicFrameLocks xmlns:a="http://schemas.openxmlformats.org/drawingml/2006/main" noChangeAspect="1"/>
+            </wp:cNvGraphicFramePr>
+            <a:graphic xmlns:a="http://schemas.openxmlformats.org/drawingml/2006/main">
+              <a:graphicData uri="http://schemas.openxmlformats.org/drawingml/2006/picture">
+                <pic:pic xmlns:pic="http://schemas.openxmlformats.org/drawingml/2006/picture">
+                  <pic:nvPicPr>
+                    <pic:cNvPr id="1068331820" name=""/>
+                    <pic:cNvPicPr/>
+                  </pic:nvPicPr>
+                  <pic:blipFill>
+                    <a:blip r:embed="rId23"/>
+                    <a:stretch>
+                      <a:fillRect/>
+                    </a:stretch>
+                  </pic:blipFill>
+                  <pic:spPr>
+                    <a:xfrm>
+                      <a:off x="0" y="0"/>
+                      <a:ext cx="5943600" cy="3343275"/>
+                    </a:xfrm>
+                    <a:prstGeom prst="rect">
+                      <a:avLst/>
+                    </a:prstGeom>
+                  </pic:spPr>
+                </pic:pic>
+              </a:graphicData>
+            </a:graphic>
+          </wp:inline>
+        </w:drawing>
+      </w:r>
+      <w:r>
+        <w:tab/>
+      </w:r>
+      <w:r>
+        <w:tab/>
+      </w:r>
+      <w:r>
+        <w:tab/>
+      </w:r>
+      <w:r>
+        <w:tab/>
+      </w:r>
+    </w:p>
+    <w:p>
+      <w:pPr>
+        <w:ind w:left="360"/>
+      </w:pPr>
+      <w:r>
+        <w:tab/>
+        <w:t>Bài 4: Chạy ứng dụng Node.js với Docker Compose</w:t>
+      </w:r>
+      <w:r>
+        <w:tab/>
+      </w:r>
+      <w:r>
+        <w:tab/>
+      </w:r>
+      <w:r>
+        <w:tab/>
+      </w:r>
+      <w:r>
+        <w:tab/>
+      </w:r>
+    </w:p>
+    <w:p>
+      <w:pPr>
+        <w:ind w:left="360"/>
+      </w:pPr>
+      <w:r>
+        <w:tab/>
+      </w:r>
+      <w:r>
+        <w:tab/>
+        <w:t>Yêu cầu:</w:t>
+      </w:r>
+      <w:r>
+        <w:tab/>
+      </w:r>
+      <w:r>
+        <w:tab/>
+      </w:r>
+      <w:r>
+        <w:tab/>
+      </w:r>
+    </w:p>
+    <w:p>
+      <w:pPr>
+        <w:ind w:left="360"/>
+      </w:pPr>
+      <w:r>
+        <w:tab/>
+      </w:r>
+      <w:r>
+        <w:tab/>
+        <w:t>Chạy một ứng dụng Node.js đơn giản với Express.</w:t>
+      </w:r>
+      <w:r>
+        <w:tab/>
+      </w:r>
+      <w:r>
+        <w:tab/>
+      </w:r>
+      <w:r>
+        <w:tab/>
+      </w:r>
+    </w:p>
+    <w:p>
+      <w:pPr>
+        <w:ind w:left="360"/>
+      </w:pPr>
+      <w:r>
+        <w:lastRenderedPageBreak/>
+        <w:tab/>
+      </w:r>
+      <w:r>
+        <w:drawing>
+          <wp:inline distT="0" distB="0" distL="0" distR="0" wp14:anchorId="25619319" wp14:editId="7BA8ECA3">
+            <wp:extent cx="5943600" cy="3343275"/>
+            <wp:effectExtent l="0" t="0" r="0" b="9525"/>
+            <wp:docPr id="1418380250" name="Picture 1"/>
+            <wp:cNvGraphicFramePr>
+              <a:graphicFrameLocks xmlns:a="http://schemas.openxmlformats.org/drawingml/2006/main" noChangeAspect="1"/>
+            </wp:cNvGraphicFramePr>
+            <a:graphic xmlns:a="http://schemas.openxmlformats.org/drawingml/2006/main">
+              <a:graphicData uri="http://schemas.openxmlformats.org/drawingml/2006/picture">
+                <pic:pic xmlns:pic="http://schemas.openxmlformats.org/drawingml/2006/picture">
+                  <pic:nvPicPr>
+                    <pic:cNvPr id="1418380250" name=""/>
+                    <pic:cNvPicPr/>
+                  </pic:nvPicPr>
+                  <pic:blipFill>
+                    <a:blip r:embed="rId24"/>
+                    <a:stretch>
+                      <a:fillRect/>
+                    </a:stretch>
+                  </pic:blipFill>
+                  <pic:spPr>
+                    <a:xfrm>
+                      <a:off x="0" y="0"/>
+                      <a:ext cx="5943600" cy="3343275"/>
+                    </a:xfrm>
+                    <a:prstGeom prst="rect">
+                      <a:avLst/>
+                    </a:prstGeom>
+                  </pic:spPr>
+                </pic:pic>
+              </a:graphicData>
+            </a:graphic>
+          </wp:inline>
+        </w:drawing>
+      </w:r>
+      <w:r>
+        <w:drawing>
+          <wp:inline distT="0" distB="0" distL="0" distR="0" wp14:anchorId="75C81871" wp14:editId="2AD19696">
+            <wp:extent cx="5943600" cy="3343275"/>
+            <wp:effectExtent l="0" t="0" r="0" b="9525"/>
+            <wp:docPr id="577160618" name="Picture 1"/>
+            <wp:cNvGraphicFramePr>
+              <a:graphicFrameLocks xmlns:a="http://schemas.openxmlformats.org/drawingml/2006/main" noChangeAspect="1"/>
+            </wp:cNvGraphicFramePr>
+            <a:graphic xmlns:a="http://schemas.openxmlformats.org/drawingml/2006/main">
+              <a:graphicData uri="http://schemas.openxmlformats.org/drawingml/2006/picture">
+                <pic:pic xmlns:pic="http://schemas.openxmlformats.org/drawingml/2006/picture">
+                  <pic:nvPicPr>
+                    <pic:cNvPr id="577160618" name=""/>
+                    <pic:cNvPicPr/>
+                  </pic:nvPicPr>
+                  <pic:blipFill>
+                    <a:blip r:embed="rId25"/>
+                    <a:stretch>
+                      <a:fillRect/>
+                    </a:stretch>
+                  </pic:blipFill>
+                  <pic:spPr>
+                    <a:xfrm>
+                      <a:off x="0" y="0"/>
+                      <a:ext cx="5943600" cy="3343275"/>
+                    </a:xfrm>
+                    <a:prstGeom prst="rect">
+                      <a:avLst/>
+                    </a:prstGeom>
+                  </pic:spPr>
+                </pic:pic>
+              </a:graphicData>
+            </a:graphic>
+          </wp:inline>
+        </w:drawing>
+      </w:r>
+      <w:r>
+        <w:tab/>
+      </w:r>
+      <w:r>
+        <w:tab/>
+      </w:r>
+      <w:r>
+        <w:tab/>
+      </w:r>
+      <w:r>
+        <w:tab/>
+      </w:r>
+    </w:p>
+    <w:p>
+      <w:pPr>
+        <w:ind w:left="360"/>
+      </w:pPr>
+      <w:r>
+        <w:tab/>
+        <w:t>Bài 5: Chạy Redis với Docker Compose</w:t>
+      </w:r>
+      <w:r>
+        <w:tab/>
+      </w:r>
+      <w:r>
+        <w:tab/>
+      </w:r>
+      <w:r>
+        <w:tab/>
+      </w:r>
+      <w:r>
+        <w:tab/>
+      </w:r>
+    </w:p>
+    <w:p>
+      <w:pPr>
+        <w:ind w:left="360"/>
+      </w:pPr>
+      <w:r>
+        <w:tab/>
+      </w:r>
+      <w:r>
+        <w:tab/>
+        <w:t>Yêu cầu:</w:t>
+      </w:r>
+      <w:r>
+        <w:tab/>
+      </w:r>
+      <w:r>
+        <w:tab/>
+      </w:r>
+      <w:r>
+        <w:tab/>
+      </w:r>
+    </w:p>
+    <w:p>
+      <w:pPr>
+        <w:ind w:left="360"/>
+      </w:pPr>
+      <w:r>
+        <w:tab/>
+      </w:r>
+      <w:r>
+        <w:tab/>
+        <w:t>Chạy một container Redis trên cổng 6379.</w:t>
+      </w:r>
+      <w:r>
+        <w:tab/>
+      </w:r>
+    </w:p>
+    <w:p>
+      <w:pPr>
+        <w:ind w:left="360"/>
+      </w:pPr>
+      <w:r>
+        <w:lastRenderedPageBreak/>
+        <w:drawing>
+          <wp:inline distT="0" distB="0" distL="0" distR="0" wp14:anchorId="6D988998" wp14:editId="4AAC81FB">
+            <wp:extent cx="5943600" cy="3343275"/>
+            <wp:effectExtent l="0" t="0" r="0" b="9525"/>
+            <wp:docPr id="1598159286" name="Picture 1"/>
+            <wp:cNvGraphicFramePr>
+              <a:graphicFrameLocks xmlns:a="http://schemas.openxmlformats.org/drawingml/2006/main" noChangeAspect="1"/>
+            </wp:cNvGraphicFramePr>
+            <a:graphic xmlns:a="http://schemas.openxmlformats.org/drawingml/2006/main">
+              <a:graphicData uri="http://schemas.openxmlformats.org/drawingml/2006/picture">
+                <pic:pic xmlns:pic="http://schemas.openxmlformats.org/drawingml/2006/picture">
+                  <pic:nvPicPr>
+                    <pic:cNvPr id="1598159286" name=""/>
+                    <pic:cNvPicPr/>
+                  </pic:nvPicPr>
+                  <pic:blipFill>
+                    <a:blip r:embed="rId26"/>
+                    <a:stretch>
+                      <a:fillRect/>
+                    </a:stretch>
+                  </pic:blipFill>
+                  <pic:spPr>
+                    <a:xfrm>
+                      <a:off x="0" y="0"/>
+                      <a:ext cx="5943600" cy="3343275"/>
+                    </a:xfrm>
+                    <a:prstGeom prst="rect">
+                      <a:avLst/>
+                    </a:prstGeom>
+                  </pic:spPr>
+                </pic:pic>
+              </a:graphicData>
+            </a:graphic>
+          </wp:inline>
+        </w:drawing>
+      </w:r>
+      <w:r>
+        <w:tab/>
+      </w:r>
+      <w:r>
+        <w:tab/>
+      </w:r>
+    </w:p>
+    <w:p>
+      <w:pPr>
+        <w:ind w:left="360"/>
+      </w:pPr>
+      <w:r>
+        <w:tab/>
+      </w:r>
+      <w:r>
+        <w:tab/>
+      </w:r>
+      <w:r>
+        <w:tab/>
+      </w:r>
+      <w:r>
+        <w:tab/>
+      </w:r>
+      <w:r>
+        <w:tab/>
+      </w:r>
+    </w:p>
+    <w:p>
+      <w:pPr>
+        <w:ind w:left="360"/>
+      </w:pPr>
+      <w:r>
+        <w:tab/>
+        <w:t>Bài 6: Chạy WordPress với MySQL</w:t>
+      </w:r>
+      <w:r>
+        <w:tab/>
+      </w:r>
+      <w:r>
+        <w:tab/>
+      </w:r>
+      <w:r>
+        <w:tab/>
+      </w:r>
+      <w:r>
+        <w:tab/>
+      </w:r>
+    </w:p>
+    <w:p>
+      <w:pPr>
+        <w:ind w:left="360"/>
+      </w:pPr>
+      <w:r>
+        <w:tab/>
+      </w:r>
+      <w:r>
+        <w:tab/>
+        <w:t>Yêu cầu:</w:t>
+      </w:r>
+      <w:r>
+        <w:tab/>
+      </w:r>
+      <w:r>
+        <w:tab/>
+      </w:r>
+      <w:r>
+        <w:tab/>
+      </w:r>
+    </w:p>
+    <w:p>
+      <w:pPr>
+        <w:ind w:left="360"/>
+      </w:pPr>
+      <w:r>
+        <w:tab/>
+      </w:r>
+      <w:r>
+        <w:tab/>
+        <w:t>Chạy WordPress với MySQL bằng Docker Compose.</w:t>
+      </w:r>
+      <w:r>
+        <w:tab/>
+      </w:r>
+      <w:r>
+        <w:tab/>
+      </w:r>
+      <w:r>
+        <w:tab/>
+      </w:r>
+    </w:p>
+    <w:p>
+      <w:pPr>
+        <w:ind w:left="360"/>
+      </w:pPr>
+      <w:r>
+        <w:tab/>
+      </w:r>
+      <w:r>
+        <w:tab/>
+      </w:r>
+      <w:r>
+        <w:lastRenderedPageBreak/>
+        <w:drawing>
+          <wp:inline distT="0" distB="0" distL="0" distR="0" wp14:anchorId="42D81D49" wp14:editId="156D97C7">
+            <wp:extent cx="5943600" cy="3343275"/>
+            <wp:effectExtent l="0" t="0" r="0" b="9525"/>
+            <wp:docPr id="575700964" name="Picture 1"/>
+            <wp:cNvGraphicFramePr>
+              <a:graphicFrameLocks xmlns:a="http://schemas.openxmlformats.org/drawingml/2006/main" noChangeAspect="1"/>
+            </wp:cNvGraphicFramePr>
+            <a:graphic xmlns:a="http://schemas.openxmlformats.org/drawingml/2006/main">
+              <a:graphicData uri="http://schemas.openxmlformats.org/drawingml/2006/picture">
+                <pic:pic xmlns:pic="http://schemas.openxmlformats.org/drawingml/2006/picture">
+                  <pic:nvPicPr>
+                    <pic:cNvPr id="575700964" name=""/>
+                    <pic:cNvPicPr/>
+                  </pic:nvPicPr>
+                  <pic:blipFill>
+                    <a:blip r:embed="rId27"/>
+                    <a:stretch>
+                      <a:fillRect/>
+                    </a:stretch>
+                  </pic:blipFill>
+                  <pic:spPr>
+                    <a:xfrm>
+                      <a:off x="0" y="0"/>
+                      <a:ext cx="5943600" cy="3343275"/>
+                    </a:xfrm>
+                    <a:prstGeom prst="rect">
+                      <a:avLst/>
+                    </a:prstGeom>
+                  </pic:spPr>
+                </pic:pic>
+              </a:graphicData>
+            </a:graphic>
+          </wp:inline>
+        </w:drawing>
+      </w:r>
+      <w:r>
+        <w:tab/>
+      </w:r>
+      <w:r>
+        <w:tab/>
+      </w:r>
+      <w:r>
+        <w:tab/>
+      </w:r>
+    </w:p>
+    <w:p>
+      <w:pPr>
+        <w:ind w:left="360"/>
+      </w:pPr>
+      <w:r>
+        <w:tab/>
+        <w:t>Bài 7: Chạy MongoDB với Docker Compose</w:t>
+      </w:r>
+      <w:r>
+        <w:tab/>
+      </w:r>
+      <w:r>
+        <w:tab/>
+      </w:r>
+      <w:r>
+        <w:tab/>
+      </w:r>
+      <w:r>
+        <w:tab/>
+      </w:r>
+    </w:p>
+    <w:p>
+      <w:pPr>
+        <w:ind w:left="360"/>
+      </w:pPr>
+      <w:r>
+        <w:tab/>
+      </w:r>
+      <w:r>
+        <w:tab/>
+        <w:t>Yêu cầu:</w:t>
+      </w:r>
+      <w:r>
+        <w:tab/>
+      </w:r>
+      <w:r>
+        <w:tab/>
+      </w:r>
+      <w:r>
+        <w:tab/>
+      </w:r>
+    </w:p>
+    <w:p>
+      <w:pPr>
+        <w:ind w:left="360"/>
+      </w:pPr>
+      <w:r>
+        <w:tab/>
+      </w:r>
+      <w:r>
+        <w:tab/>
+        <w:t>Chạy MongoDB và Mongo Express để quản lý.</w:t>
+      </w:r>
+      <w:r>
+        <w:tab/>
+      </w:r>
+      <w:r>
+        <w:tab/>
+      </w:r>
+      <w:r>
+        <w:tab/>
+      </w:r>
+    </w:p>
+    <w:p>
+      <w:pPr>
+        <w:ind w:left="360"/>
+      </w:pPr>
+      <w:r>
+        <w:lastRenderedPageBreak/>
+        <w:tab/>
+      </w:r>
+      <w:r>
+        <w:drawing>
+          <wp:inline distT="0" distB="0" distL="0" distR="0" wp14:anchorId="50C4D291" wp14:editId="0865AE91">
+            <wp:extent cx="5943600" cy="3343275"/>
+            <wp:effectExtent l="0" t="0" r="0" b="9525"/>
+            <wp:docPr id="399345299" name="Picture 1"/>
+            <wp:cNvGraphicFramePr>
+              <a:graphicFrameLocks xmlns:a="http://schemas.openxmlformats.org/drawingml/2006/main" noChangeAspect="1"/>
+            </wp:cNvGraphicFramePr>
+            <a:graphic xmlns:a="http://schemas.openxmlformats.org/drawingml/2006/main">
+              <a:graphicData uri="http://schemas.openxmlformats.org/drawingml/2006/picture">
+                <pic:pic xmlns:pic="http://schemas.openxmlformats.org/drawingml/2006/picture">
+                  <pic:nvPicPr>
+                    <pic:cNvPr id="399345299" name=""/>
+                    <pic:cNvPicPr/>
+                  </pic:nvPicPr>
+                  <pic:blipFill>
+                    <a:blip r:embed="rId28"/>
+                    <a:stretch>
+                      <a:fillRect/>
+                    </a:stretch>
+                  </pic:blipFill>
+                  <pic:spPr>
+                    <a:xfrm>
+                      <a:off x="0" y="0"/>
+                      <a:ext cx="5943600" cy="3343275"/>
+                    </a:xfrm>
+                    <a:prstGeom prst="rect">
+                      <a:avLst/>
+                    </a:prstGeom>
+                  </pic:spPr>
+                </pic:pic>
+              </a:graphicData>
+            </a:graphic>
+          </wp:inline>
+        </w:drawing>
+      </w:r>
+      <w:r>
+        <w:tab/>
+      </w:r>
+      <w:r>
+        <w:tab/>
+      </w:r>
+      <w:r>
+        <w:tab/>
+      </w:r>
+      <w:r>
+        <w:tab/>
+      </w:r>
+    </w:p>
+    <w:p>
+      <w:pPr>
+        <w:ind w:left="360"/>
+      </w:pPr>
+      <w:r>
+        <w:tab/>
+        <w:t>Bài 8: Kết nối nhiều dịch vụ với Docker Compose</w:t>
+      </w:r>
+      <w:r>
+        <w:tab/>
+      </w:r>
+      <w:r>
+        <w:tab/>
+      </w:r>
+      <w:r>
+        <w:tab/>
+      </w:r>
+      <w:r>
+        <w:tab/>
+      </w:r>
+    </w:p>
+    <w:p>
+      <w:pPr>
+        <w:ind w:left="360"/>
+      </w:pPr>
+      <w:r>
+        <w:tab/>
+      </w:r>
+      <w:r>
+        <w:tab/>
+        <w:t>Yêu cầu:</w:t>
+      </w:r>
+      <w:r>
+        <w:tab/>
+      </w:r>
+      <w:r>
+        <w:tab/>
+      </w:r>
+      <w:r>
+        <w:tab/>
+      </w:r>
+    </w:p>
+    <w:p>
+      <w:pPr>
+        <w:ind w:left="360"/>
+      </w:pPr>
+      <w:r>
+        <w:tab/>
+      </w:r>
+      <w:r>
+        <w:tab/>
+        <w:t>Chạy Node.js kết nối với MySQL.</w:t>
+      </w:r>
+      <w:r>
+        <w:tab/>
+      </w:r>
+      <w:r>
+        <w:tab/>
+      </w:r>
+      <w:r>
+        <w:tab/>
+      </w:r>
+    </w:p>
+    <w:p>
+      <w:pPr>
+        <w:ind w:left="360"/>
+      </w:pPr>
+      <w:r>
+        <w:tab/>
+      </w:r>
+      <w:r>
+        <w:tab/>
+      </w:r>
+      <w:r>
+        <w:tab/>
+      </w:r>
+      <w:r>
+        <w:tab/>
+      </w:r>
+      <w:r>
+        <w:tab/>
+      </w:r>
+    </w:p>
+    <w:p>
+      <w:pPr>
+        <w:ind w:left="360"/>
+      </w:pPr>
+      <w:r>
+        <w:tab/>
+        <w:t>Bài 9: Chạy ứng dụng Python Flask với Docker Compose</w:t>
+      </w:r>
+      <w:r>
+        <w:tab/>
+      </w:r>
+      <w:r>
+        <w:tab/>
+      </w:r>
+      <w:r>
+        <w:tab/>
+      </w:r>
+      <w:r>
+        <w:tab/>
+      </w:r>
+    </w:p>
+    <w:p>
+      <w:pPr>
+        <w:ind w:left="360"/>
+      </w:pPr>
+      <w:r>
+        <w:tab/>
+      </w:r>
+      <w:r>
+        <w:tab/>
+        <w:t>Yêu cầu:</w:t>
+      </w:r>
+      <w:r>
+        <w:tab/>
+      </w:r>
+      <w:r>
+        <w:tab/>
+      </w:r>
+      <w:r>
+        <w:tab/>
+      </w:r>
+    </w:p>
+    <w:p>
+      <w:pPr>
+        <w:ind w:left="360"/>
+      </w:pPr>
+      <w:r>
+        <w:tab/>
+      </w:r>
+      <w:r>
+        <w:tab/>
+        <w:t>Chạy ứng dụng Flask đơn giản với Docker Compose.</w:t>
+      </w:r>
+      <w:r>
+        <w:tab/>
+      </w:r>
+      <w:r>
+        <w:tab/>
+      </w:r>
+      <w:r>
+        <w:tab/>
+      </w:r>
+    </w:p>
+    <w:p>
+      <w:pPr>
+        <w:ind w:left="360"/>
+      </w:pPr>
+      <w:r>
+        <w:lastRenderedPageBreak/>
+        <w:tab/>
+      </w:r>
+      <w:r>
+        <w:drawing>
+          <wp:inline distT="0" distB="0" distL="0" distR="0" wp14:anchorId="69018BDB" wp14:editId="5798720A">
+            <wp:extent cx="5943600" cy="3343275"/>
+            <wp:effectExtent l="0" t="0" r="0" b="9525"/>
+            <wp:docPr id="1364456721" name="Picture 1"/>
+            <wp:cNvGraphicFramePr>
+              <a:graphicFrameLocks xmlns:a="http://schemas.openxmlformats.org/drawingml/2006/main" noChangeAspect="1"/>
+            </wp:cNvGraphicFramePr>
+            <a:graphic xmlns:a="http://schemas.openxmlformats.org/drawingml/2006/main">
+              <a:graphicData uri="http://schemas.openxmlformats.org/drawingml/2006/picture">
+                <pic:pic xmlns:pic="http://schemas.openxmlformats.org/drawingml/2006/picture">
+                  <pic:nvPicPr>
+                    <pic:cNvPr id="1364456721" name=""/>
+                    <pic:cNvPicPr/>
+                  </pic:nvPicPr>
+                  <pic:blipFill>
+                    <a:blip r:embed="rId29"/>
+                    <a:stretch>
+                      <a:fillRect/>
+                    </a:stretch>
+                  </pic:blipFill>
+                  <pic:spPr>
+                    <a:xfrm>
+                      <a:off x="0" y="0"/>
+                      <a:ext cx="5943600" cy="3343275"/>
+                    </a:xfrm>
+                    <a:prstGeom prst="rect">
+                      <a:avLst/>
+                    </a:prstGeom>
+                  </pic:spPr>
+                </pic:pic>
+              </a:graphicData>
+            </a:graphic>
+          </wp:inline>
+        </w:drawing>
+      </w:r>
+      <w:r>
+        <w:tab/>
+      </w:r>
+      <w:r>
+        <w:tab/>
+      </w:r>
+      <w:r>
+        <w:tab/>
+      </w:r>
+      <w:r>
+        <w:tab/>
+      </w:r>
+    </w:p>
+    <w:p>
+      <w:pPr>
+        <w:ind w:left="360"/>
+      </w:pPr>
+      <w:r>
+        <w:tab/>
+        <w:t>Bài 10: Lưu trữ dữ liệu với Docker Volumes</w:t>
+      </w:r>
+      <w:r>
+        <w:tab/>
+      </w:r>
+      <w:r>
+        <w:tab/>
+      </w:r>
+      <w:r>
+        <w:tab/>
+      </w:r>
+      <w:r>
+        <w:tab/>
+      </w:r>
+    </w:p>
+    <w:p>
+      <w:pPr>
+        <w:ind w:left="360"/>
+      </w:pPr>
+      <w:r>
+        <w:tab/>
+      </w:r>
+      <w:r>
+        <w:tab/>
+        <w:t>Yêu cầu:</w:t>
+      </w:r>
+      <w:r>
+        <w:tab/>
+      </w:r>
+      <w:r>
+        <w:tab/>
+      </w:r>
+      <w:r>
+        <w:tab/>
+      </w:r>
+    </w:p>
+    <w:p>
+      <w:pPr>
+        <w:ind w:left="360"/>
+      </w:pPr>
+      <w:r>
+        <w:tab/>
+      </w:r>
+      <w:r>
+        <w:tab/>
+        <w:t>Chạy MySQL và gắn volume để dữ liệu không bị mất.</w:t>
+      </w:r>
+      <w:r>
+        <w:tab/>
+      </w:r>
+      <w:r>
+        <w:tab/>
+      </w:r>
+      <w:r>
+        <w:tab/>
+      </w:r>
+    </w:p>
+    <w:p>
+      <w:pPr>
+        <w:ind w:left="360"/>
+      </w:pPr>
+      <w:r>
+        <w:lastRenderedPageBreak/>
+        <w:tab/>
+      </w:r>
+      <w:r>
+        <w:drawing>
+          <wp:inline distT="0" distB="0" distL="0" distR="0" wp14:anchorId="29049020" wp14:editId="412B43D9">
+            <wp:extent cx="5943600" cy="3343275"/>
+            <wp:effectExtent l="0" t="0" r="0" b="9525"/>
+            <wp:docPr id="2012995022" name="Picture 1"/>
+            <wp:cNvGraphicFramePr>
+              <a:graphicFrameLocks xmlns:a="http://schemas.openxmlformats.org/drawingml/2006/main" noChangeAspect="1"/>
+            </wp:cNvGraphicFramePr>
+            <a:graphic xmlns:a="http://schemas.openxmlformats.org/drawingml/2006/main">
+              <a:graphicData uri="http://schemas.openxmlformats.org/drawingml/2006/picture">
+                <pic:pic xmlns:pic="http://schemas.openxmlformats.org/drawingml/2006/picture">
+                  <pic:nvPicPr>
+                    <pic:cNvPr id="2012995022" name=""/>
+                    <pic:cNvPicPr/>
+                  </pic:nvPicPr>
+                  <pic:blipFill>
+                    <a:blip r:embed="rId30"/>
+                    <a:stretch>
+                      <a:fillRect/>
+                    </a:stretch>
+                  </pic:blipFill>
+                  <pic:spPr>
+                    <a:xfrm>
+                      <a:off x="0" y="0"/>
+                      <a:ext cx="5943600" cy="3343275"/>
+                    </a:xfrm>
+                    <a:prstGeom prst="rect">
+                      <a:avLst/>
+                    </a:prstGeom>
+                  </pic:spPr>
+                </pic:pic>
+              </a:graphicData>
+            </a:graphic>
+          </wp:inline>
+        </w:drawing>
+      </w:r>
+      <w:r>
+        <w:tab/>
+      </w:r>
+      <w:r>
+        <w:tab/>
+      </w:r>
+      <w:r>
+        <w:tab/>
+      </w:r>
+      <w:r>
+        <w:tab/>
+      </w:r>
+    </w:p>
+    <w:p>
+      <w:pPr>
+        <w:ind w:left="360"/>
+      </w:pPr>
+      <w:r>
+        <w:tab/>
+        <w:t>Bài 11: Chạy dịch vụ Postgres với Adminer</w:t>
+      </w:r>
+      <w:r>
+        <w:tab/>
+      </w:r>
+      <w:r>
+        <w:tab/>
+      </w:r>
+      <w:r>
+        <w:tab/>
+      </w:r>
+      <w:r>
+        <w:tab/>
+      </w:r>
+    </w:p>
+    <w:p>
+      <w:pPr>
+        <w:ind w:left="360"/>
+      </w:pPr>
+      <w:r>
+        <w:tab/>
+      </w:r>
+      <w:r>
+        <w:tab/>
+        <w:t>Yêu cầu:</w:t>
+      </w:r>
+      <w:r>
+        <w:tab/>
+      </w:r>
+      <w:r>
+        <w:tab/>
+      </w:r>
+      <w:r>
+        <w:tab/>
+      </w:r>
+    </w:p>
+    <w:p>
+      <w:pPr>
+        <w:ind w:left="360"/>
+      </w:pPr>
+      <w:r>
+        <w:tab/>
+      </w:r>
+      <w:r>
+        <w:tab/>
+        <w:t>Chạy PostgreSQL và Adminer (công cụ quản lý database) bằng Docker Compose.</w:t>
+      </w:r>
+      <w:r>
+        <w:tab/>
+      </w:r>
+      <w:r>
+        <w:tab/>
+      </w:r>
+      <w:r>
+        <w:tab/>
+      </w:r>
+    </w:p>
+    <w:p>
+      <w:pPr>
+        <w:ind w:left="360"/>
+      </w:pPr>
+      <w:r>
+        <w:tab/>
+      </w:r>
+      <w:r>
+        <w:tab/>
+        <w:t>PostgreSQL phải có database tên mydb, user là user, password là password.</w:t>
+      </w:r>
+      <w:r>
+        <w:tab/>
+      </w:r>
+      <w:r>
+        <w:tab/>
+      </w:r>
+      <w:r>
+        <w:tab/>
+      </w:r>
+    </w:p>
+    <w:p>
+      <w:pPr>
+        <w:ind w:left="360"/>
+      </w:pPr>
+      <w:r>
+        <w:tab/>
+      </w:r>
+      <w:r>
+        <w:tab/>
+        <w:t>Adminer chạy trên cổng 8083</w:t>
+      </w:r>
+      <w:r>
+        <w:tab/>
+      </w:r>
+      <w:r>
+        <w:tab/>
+      </w:r>
+      <w:r>
+        <w:tab/>
+      </w:r>
+    </w:p>
+    <w:p>
+      <w:pPr>
+        <w:ind w:left="360"/>
+      </w:pPr>
+      <w:r>
+        <w:tab/>
+      </w:r>
+      <w:r>
+        <w:tab/>
+      </w:r>
+      <w:r>
+        <w:tab/>
+      </w:r>
+      <w:r>
+        <w:tab/>
+      </w:r>
+      <w:r>
+        <w:tab/>
+      </w:r>
+    </w:p>
+    <w:p>
+      <w:pPr>
+        <w:ind w:left="360"/>
+      </w:pPr>
+      <w:r>
+        <w:tab/>
+        <w:t>Bài 12: Giám sát container với Prometheus và Grafana</w:t>
+      </w:r>
+      <w:r>
+        <w:tab/>
+      </w:r>
+      <w:r>
+        <w:tab/>
+      </w:r>
+      <w:r>
+        <w:tab/>
+      </w:r>
+      <w:r>
+        <w:tab/>
+      </w:r>
+    </w:p>
+    <w:p>
+      <w:pPr>
+        <w:ind w:left="360"/>
+      </w:pPr>
+      <w:r>
+        <w:tab/>
+      </w:r>
+      <w:r>
+        <w:tab/>
+        <w:t>Yêu cầu:</w:t>
+      </w:r>
+      <w:r>
+        <w:tab/>
+      </w:r>
+      <w:r>
+        <w:tab/>
+      </w:r>
+      <w:r>
+        <w:tab/>
+      </w:r>
+    </w:p>
+    <w:p>
+      <w:pPr>
+        <w:ind w:left="360"/>
+      </w:pPr>
+      <w:r>
+        <w:tab/>
+      </w:r>
+      <w:r>
+        <w:tab/>
+        <w:t>Chạy Prometheus, Grafana và Node Exporter bằng Docker Compose để giám sát hệ thống.</w:t>
+      </w:r>
+      <w:r>
+        <w:tab/>
+      </w:r>
+      <w:r>
+        <w:tab/>
+      </w:r>
+      <w:r>
+        <w:tab/>
+      </w:r>
+    </w:p>
+    <w:p>
+      <w:pPr>
+        <w:ind w:left="360"/>
+      </w:pPr>
+      <w:r>
+        <w:tab/>
+      </w:r>
+      <w:r>
+        <w:tab/>
+      </w:r>
+      <w:r>
+        <w:tab/>
+      </w:r>
+      <w:r>
+        <w:tab/>
+      </w:r>
+      <w:r>
+        <w:tab/>
+      </w:r>
+    </w:p>
+    <w:p>
+      <w:pPr>
+        <w:ind w:left="360"/>
+      </w:pPr>
+      <w:r>
+        <w:tab/>
+        <w:t>Bài 13: Chạy ứng dụng React với Nginx</w:t>
+      </w:r>
+      <w:r>
+        <w:tab/>
+      </w:r>
+      <w:r>
+        <w:tab/>
+      </w:r>
+      <w:r>
+        <w:tab/>
+      </w:r>
+      <w:r>
+        <w:tab/>
+      </w:r>
+    </w:p>
+    <w:p>
+      <w:pPr>
+        <w:ind w:left="360"/>
+      </w:pPr>
+      <w:r>
+        <w:tab/>
+      </w:r>
+      <w:r>
+        <w:tab/>
+        <w:t>Yêu cầu:</w:t>
+      </w:r>
+      <w:r>
+        <w:tab/>
+      </w:r>
+      <w:r>
+        <w:tab/>
+      </w:r>
+      <w:r>
+        <w:tab/>
+      </w:r>
+    </w:p>
+    <w:p>
+      <w:pPr>
+        <w:ind w:left="360"/>
+      </w:pPr>
+      <w:r>
+        <w:tab/>
+      </w:r>
+      <w:r>
+        <w:tab/>
+        <w:t>Chạy một ứng dụng React và serve nó bằng Nginx.</w:t>
+      </w:r>
+      <w:r>
+        <w:tab/>
+      </w:r>
+      <w:r>
+        <w:tab/>
+      </w:r>
+      <w:r>
+        <w:tab/>
+      </w:r>
+    </w:p>
+    <w:p>
+      <w:pPr>
+        <w:ind w:left="360"/>
+      </w:pPr>
+      <w:r>
+        <w:lastRenderedPageBreak/>
+        <w:tab/>
+      </w:r>
+      <w:r>
+        <w:tab/>
+      </w:r>
+      <w:r>
+        <w:tab/>
+      </w:r>
+      <w:r>
+        <w:tab/>
+      </w:r>
+      <w:r>
+        <w:tab/>
+      </w:r>
+    </w:p>
+    <w:p>
+      <w:pPr>
+        <w:ind w:left="360"/>
+      </w:pPr>
+      <w:r>
+        <w:tab/>
+        <w:t>Bài 14: Cấu hình mạng riêng giữa các container</w:t>
+      </w:r>
+      <w:r>
+        <w:tab/>
+      </w:r>
+      <w:r>
+        <w:tab/>
+      </w:r>
+      <w:r>
+        <w:tab/>
+      </w:r>
+      <w:r>
+        <w:tab/>
+      </w:r>
+    </w:p>
+    <w:p>
+      <w:pPr>
+        <w:ind w:left="360"/>
+      </w:pPr>
+      <w:r>
+        <w:tab/>
+      </w:r>
+      <w:r>
+        <w:tab/>
+        <w:t>Yêu cầu:</w:t>
+      </w:r>
+      <w:r>
+        <w:tab/>
+      </w:r>
+      <w:r>
+        <w:tab/>
+      </w:r>
+      <w:r>
+        <w:tab/>
+      </w:r>
+    </w:p>
+    <w:p>
+      <w:pPr>
+        <w:ind w:left="360"/>
+      </w:pPr>
+      <w:r>
+        <w:tab/>
+      </w:r>
+      <w:r>
+        <w:tab/>
+        <w:t>Chạy 2 container có thể giao tiếp với nhau trong một mạng riêng.</w:t>
+      </w:r>
+      <w:r>
+        <w:tab/>
+      </w:r>
+      <w:r>
+        <w:tab/>
+      </w:r>
+      <w:r>
+        <w:tab/>
+      </w:r>
+    </w:p>
+    <w:p>
+      <w:pPr>
+        <w:ind w:left="360"/>
+      </w:pPr>
+      <w:r>
+        <w:tab/>
+      </w:r>
+      <w:r>
+        <w:tab/>
+      </w:r>
+      <w:r>
+        <w:drawing>
+          <wp:inline distT="0" distB="0" distL="0" distR="0" wp14:anchorId="09CAA461" wp14:editId="4D9C8DEF">
+            <wp:extent cx="5943600" cy="3343275"/>
+            <wp:effectExtent l="0" t="0" r="0" b="9525"/>
+            <wp:docPr id="1943053659" name="Picture 1"/>
+            <wp:cNvGraphicFramePr>
+              <a:graphicFrameLocks xmlns:a="http://schemas.openxmlformats.org/drawingml/2006/main" noChangeAspect="1"/>
+            </wp:cNvGraphicFramePr>
+            <a:graphic xmlns:a="http://schemas.openxmlformats.org/drawingml/2006/main">
+              <a:graphicData uri="http://schemas.openxmlformats.org/drawingml/2006/picture">
+                <pic:pic xmlns:pic="http://schemas.openxmlformats.org/drawingml/2006/picture">
+                  <pic:nvPicPr>
+                    <pic:cNvPr id="1943053659" name=""/>
+                    <pic:cNvPicPr/>
+                  </pic:nvPicPr>
+                  <pic:blipFill>
+                    <a:blip r:embed="rId31"/>
+                    <a:stretch>
+                      <a:fillRect/>
+                    </a:stretch>
+                  </pic:blipFill>
+                  <pic:spPr>
+                    <a:xfrm>
+                      <a:off x="0" y="0"/>
+                      <a:ext cx="5943600" cy="3343275"/>
+                    </a:xfrm>
+                    <a:prstGeom prst="rect">
+                      <a:avLst/>
+                    </a:prstGeom>
+                  </pic:spPr>
+                </pic:pic>
+              </a:graphicData>
+            </a:graphic>
+          </wp:inline>
+        </w:drawing>
+      </w:r>
+      <w:r>
+        <w:tab/>
+      </w:r>
+      <w:r>
+        <w:tab/>
+      </w:r>
+      <w:r>
+        <w:tab/>
+      </w:r>
+    </w:p>
+    <w:p>
+      <w:pPr>
+        <w:ind w:left="360"/>
+      </w:pPr>
+      <w:r>
+        <w:tab/>
+        <w:t>Bài 15: Giới hạn tài nguyên cho container</w:t>
+      </w:r>
+      <w:r>
+        <w:tab/>
+      </w:r>
+      <w:r>
+        <w:tab/>
+      </w:r>
+      <w:r>
+        <w:tab/>
+      </w:r>
+      <w:r>
+        <w:tab/>
+      </w:r>
+    </w:p>
+    <w:p>
+      <w:pPr>
+        <w:ind w:left="360"/>
+      </w:pPr>
+      <w:r>
+        <w:tab/>
+      </w:r>
+      <w:r>
+        <w:tab/>
+        <w:t>Yêu cầu:</w:t>
+      </w:r>
+      <w:r>
+        <w:tab/>
+      </w:r>
+      <w:r>
+        <w:tab/>
+      </w:r>
+      <w:r>
+        <w:tab/>
+      </w:r>
+    </w:p>
+    <w:p>
+      <w:pPr>
+        <w:ind w:left="360"/>
+      </w:pPr>
+      <w:r>
+        <w:tab/>
+      </w:r>
+      <w:r>
+        <w:tab/>
+        <w:t>Giới hạn CPU và RAM cho một container Redis.</w:t>
+      </w:r>
+      <w:r>
+        <w:tab/>
+      </w:r>
+    </w:p>
+    <w:p>
+      <w:pPr>
+        <w:ind w:left="360"/>
+      </w:pPr>
+      <w:r>
+        <w:lastRenderedPageBreak/>
+        <w:drawing>
+          <wp:inline distT="0" distB="0" distL="0" distR="0" wp14:anchorId="3DD2C9F5" wp14:editId="2002E9CC">
+            <wp:extent cx="5943600" cy="3343275"/>
+            <wp:effectExtent l="0" t="0" r="0" b="9525"/>
+            <wp:docPr id="419313062" name="Picture 1"/>
+            <wp:cNvGraphicFramePr>
+              <a:graphicFrameLocks xmlns:a="http://schemas.openxmlformats.org/drawingml/2006/main" noChangeAspect="1"/>
+            </wp:cNvGraphicFramePr>
+            <a:graphic xmlns:a="http://schemas.openxmlformats.org/drawingml/2006/main">
+              <a:graphicData uri="http://schemas.openxmlformats.org/drawingml/2006/picture">
+                <pic:pic xmlns:pic="http://schemas.openxmlformats.org/drawingml/2006/picture">
+                  <pic:nvPicPr>
+                    <pic:cNvPr id="419313062" name=""/>
+                    <pic:cNvPicPr/>
+                  </pic:nvPicPr>
+                  <pic:blipFill>
+                    <a:blip r:embed="rId32"/>
+                    <a:stretch>
+                      <a:fillRect/>
+                    </a:stretch>
+                  </pic:blipFill>
+                  <pic:spPr>
+                    <a:xfrm>
+                      <a:off x="0" y="0"/>
+                      <a:ext cx="5943600" cy="3343275"/>
+                    </a:xfrm>
+                    <a:prstGeom prst="rect">
+                      <a:avLst/>
+                    </a:prstGeom>
+                  </pic:spPr>
+                </pic:pic>
+              </a:graphicData>
+            </a:graphic>
+          </wp:inline>
+        </w:drawing>
+      </w:r>
+      <w:r>
+        <w:tab/>
+      </w:r>
+      <w:r>
+        <w:tab/>
+      </w:r>
+    </w:p>
+    <w:p>
+      <w:pPr>
+        <w:ind w:left="360"/>
+      </w:pPr>
+      <w:r>
+        <w:tab/>
+      </w:r>
+      <w:r>
+        <w:tab/>
+      </w:r>
+      <w:r>
+        <w:tab/>
+      </w:r>
+      <w:r>
+        <w:tab/>
+      </w:r>
+      <w:r>
+        <w:tab/>
       </w:r>
     </w:p>
     <w:sectPr>

</xml_diff>